<commit_message>
Update Word manuscript to match LaTeX: add benchmark table + figure
- update_docx_benchmark.py: surgically refreshes the Comparative-Evaluation
  paragraph and inserts the 8-model benchmark table (grouped GK/LOLO header,
  best-per-column in bold) + fig_benchmark image into manuscript_ieee_final.docx.
- benchmark_report.py: also export figures_svg/fig_benchmark.png (raster for Word).

Co-Authored-By: Claude Opus 4.7 (1M context) <noreply@anthropic.com>
</commit_message>
<xml_diff>
--- a/manuscript_ieee_final.docx
+++ b/manuscript_ieee_final.docx
@@ -8271,120 +8271,72 @@
           <w:i/>
           <w:iCs/>
         </w:rPr>
-        <w:t xml:space="preserve">Baseline models.</w:t>
-      </w:r>
-      <w:r>
-        <w:t xml:space="preserve"> </w:t>
-      </w:r>
-      <w:r>
-        <w:t xml:space="preserve">On detection (five-fold mean macro-F1), the physics-feature classifiers</w:t>
-      </w:r>
-      <w:r>
-        <w:t xml:space="preserve"> </w:t>
-      </w:r>
-      <w:r>
-        <w:t xml:space="preserve">cluster high—LogReg</w:t>
-      </w:r>
-      <w:r>
-        <w:t xml:space="preserve"> </w:t>
-      </w:r>
+        <w:t>Baseline models and added learners. The full model benchmark below evaluates eight models on identical leakage-safe splits, spanning classical feature-based classifiers, a tabular foundation model, and a sequence deep network. On detection the physics-feature classifiers cluster high under both protocols (macro-F1 0.95–0.98); the tabular foundation model TabPFN-2.5 is the strongest and the most load-robust, scoring macro-F1 0.979 in-distribution and 0.979 cross-load (LOLO), whereas gradient boosting falls from 0.976 to 0.948 across loads. For severity (within-one-level accuracy, the operational ordinal metric), TabPFN-2.5 is sharpest in-distribution (0.997, with the lowest mean absolute error of 0.033 level) and degrades gracefully across loads (0.969), while the MLP attains the best cross-load value (0.982); tree ensembles, by contrast, extrapolate poorly on absolute severity at unseen loads. Phase identification is load-robust for nearly all models (LOLO macro-F1 ≥ 0.96), reflecting the load-invariant negative-sequence-angle signature. The sequence model xLSTM—a compact extended-LSTM with exponential gating and a stabilizer state, applied to the raw three-phase current—trails the feature-based learners on every task (LOLO macro-F1 0.890 detection, within-one 0.908 severity, macro-F1 0.961 phase), yet it improves on the earlier raw-signal deep baselines (1-D ResNet and PCM-Net, 0.898 detection). This reaffirms the data-efficiency of physically engineered features over raw-waveform deep nets in this data regime. The feature pipeline is also lightweight: feature extraction plus XGBoost inference costs ≈0.34 ms per window on CPU.</w:t>
+      </w:r>
+      <w:r/>
+      <w:r/>
+      <w:r/>
+      <w:r/>
+      <w:r/>
       <m:oMath>
         <m:r>
           <m:t>0.979</m:t>
         </m:r>
       </m:oMath>
-      <w:r>
-        <w:t xml:space="preserve">, SVM-RBF</w:t>
-      </w:r>
-      <w:r>
-        <w:t xml:space="preserve"> </w:t>
-      </w:r>
+      <w:r/>
+      <w:r/>
       <m:oMath>
         <m:r>
           <m:t>0.978</m:t>
         </m:r>
       </m:oMath>
-      <w:r>
-        <w:t xml:space="preserve">, KNN</w:t>
-      </w:r>
-      <w:r>
-        <w:t xml:space="preserve"> </w:t>
-      </w:r>
+      <w:r/>
+      <w:r/>
       <m:oMath>
         <m:r>
           <m:t>0.982</m:t>
         </m:r>
       </m:oMath>
-      <w:r>
-        <w:t xml:space="preserve">, MLP</w:t>
-      </w:r>
-      <w:r>
-        <w:t xml:space="preserve"> </w:t>
-      </w:r>
+      <w:r/>
+      <w:r/>
       <m:oMath>
         <m:r>
           <m:t>0.979</m:t>
         </m:r>
       </m:oMath>
-      <w:r>
-        <w:t xml:space="preserve">, Random Forest</w:t>
-      </w:r>
-      <w:r>
-        <w:t xml:space="preserve"> </w:t>
-      </w:r>
+      <w:r/>
+      <w:r/>
       <m:oMath>
         <m:r>
           <m:t>0.978</m:t>
         </m:r>
       </m:oMath>
-      <w:r>
-        <w:t xml:space="preserve">,</w:t>
-      </w:r>
-      <w:r>
-        <w:t xml:space="preserve"> </w:t>
-      </w:r>
-      <w:r>
-        <w:t xml:space="preserve">XGBoost</w:t>
-      </w:r>
-      <w:r>
-        <w:t xml:space="preserve"> </w:t>
-      </w:r>
+      <w:r/>
+      <w:r/>
+      <w:r/>
+      <w:r/>
       <m:oMath>
         <m:r>
           <m:t>0.978</m:t>
         </m:r>
       </m:oMath>
-      <w:r>
-        <w:t xml:space="preserve">—while raw-signal deep models are lower (1-D ResNet</w:t>
-      </w:r>
-      <w:r>
-        <w:t xml:space="preserve"> </w:t>
-      </w:r>
+      <w:r/>
+      <w:r/>
       <m:oMath>
         <m:r>
           <m:t>0.898</m:t>
         </m:r>
       </m:oMath>
-      <w:r>
-        <w:t xml:space="preserve">, PCM-Net</w:t>
-      </w:r>
-      <w:r>
-        <w:t xml:space="preserve"> </w:t>
-      </w:r>
+      <w:r/>
+      <w:r/>
       <m:oMath>
         <m:r>
           <m:t>0.898</m:t>
         </m:r>
       </m:oMath>
-      <w:r>
-        <w:t xml:space="preserve">),</w:t>
-      </w:r>
-      <w:r>
-        <w:t xml:space="preserve"> </w:t>
-      </w:r>
-      <w:r>
-        <w:t xml:space="preserve">consistent with the data-efficiency of physically engineered features (Table </w:t>
-      </w:r>
+      <w:r/>
+      <w:r/>
+      <w:r/>
       <w:hyperlink w:anchor="tab:dl">
         <w:r>
           <w:rPr>
@@ -8393,18 +8345,10 @@
           <w:t xml:space="preserve">7</w:t>
         </w:r>
       </w:hyperlink>
-      <w:r>
-        <w:t xml:space="preserve">). The</w:t>
-      </w:r>
-      <w:r>
-        <w:t xml:space="preserve"> </w:t>
-      </w:r>
-      <w:r>
-        <w:t xml:space="preserve">feature pipeline is also lightweight: feature extraction plus XGBoost inference costs</w:t>
-      </w:r>
-      <w:r>
-        <w:t xml:space="preserve"> </w:t>
-      </w:r>
+      <w:r/>
+      <w:r/>
+      <w:r/>
+      <w:r/>
       <m:oMath>
         <m:r>
           <m:rPr>
@@ -8416,15 +8360,9 @@
           <m:t>0.34</m:t>
         </m:r>
       </m:oMath>
-      <w:r>
-        <w:t xml:space="preserve"> ms</w:t>
-      </w:r>
-      <w:r>
-        <w:t xml:space="preserve"> </w:t>
-      </w:r>
-      <w:r>
-        <w:t xml:space="preserve">per window on CPU, comfortably real-time (Fig. </w:t>
-      </w:r>
+      <w:r/>
+      <w:r/>
+      <w:r/>
       <w:hyperlink w:anchor="fig:modelcomp">
         <w:r>
           <w:rPr>
@@ -8433,9 +8371,7 @@
           <w:t xml:space="preserve">8</w:t>
         </w:r>
       </w:hyperlink>
-      <w:r>
-        <w:t xml:space="preserve">, Fig. </w:t>
-      </w:r>
+      <w:r/>
       <w:hyperlink w:anchor="fig:infer">
         <w:r>
           <w:rPr>
@@ -8444,8 +8380,1278 @@
           <w:t xml:space="preserve">9</w:t>
         </w:r>
       </w:hyperlink>
-      <w:r>
-        <w:t xml:space="preserve">).</w:t>
+      <w:r/>
+    </w:p>
+    <w:p>
+      <w:pPr>
+        <w:pStyle w:val="TableCaption"/>
+      </w:pPr>
+      <w:r>
+        <w:t>Full model benchmark on identical leakage-safe splits: StratifiedGroupKFold (GK, in-distribution) and Leave-One-Load-Out (LOLO, cross-load). Detection and phase report macro-F1; severity reports within-one-level accuracy. Best per column in bold. TabPFN-2.5 and xLSTM are added in this work.</w:t>
+      </w:r>
+    </w:p>
+    <w:tbl>
+      <w:tblPr>
+        <w:tblW w:type="auto" w:w="0"/>
+        <w:tblLook w:firstColumn="1" w:firstRow="1" w:lastColumn="0" w:lastRow="0" w:noHBand="0" w:noVBand="1" w:val="04A0"/>
+      </w:tblPr>
+      <w:tblGrid>
+        <w:gridCol w:w="1337"/>
+        <w:gridCol w:w="1337"/>
+        <w:gridCol w:w="1337"/>
+        <w:gridCol w:w="1337"/>
+        <w:gridCol w:w="1337"/>
+        <w:gridCol w:w="1337"/>
+        <w:gridCol w:w="1337"/>
+      </w:tblGrid>
+      <w:tr>
+        <w:tc>
+          <w:tcPr>
+            <w:tcW w:type="dxa" w:w="1337"/>
+          </w:tcPr>
+          <w:p>
+            <w:pPr>
+              <w:jc w:val="center"/>
+            </w:pPr>
+            <w:r/>
+            <w:r>
+              <w:rPr>
+                <w:b w:val="0"/>
+                <w:sz w:val="16"/>
+              </w:rPr>
+            </w:r>
+          </w:p>
+        </w:tc>
+        <w:tc>
+          <w:tcPr>
+            <w:tcW w:type="dxa" w:w="2674"/>
+            <w:gridSpan w:val="2"/>
+          </w:tcPr>
+          <w:p>
+            <w:pPr>
+              <w:jc w:val="center"/>
+            </w:pPr>
+            <w:r/>
+            <w:r>
+              <w:rPr>
+                <w:b/>
+                <w:sz w:val="16"/>
+              </w:rPr>
+              <w:t>Detection (macro-F1)</w:t>
+            </w:r>
+          </w:p>
+        </w:tc>
+        <w:tc>
+          <w:tcPr>
+            <w:tcW w:type="dxa" w:w="2674"/>
+            <w:gridSpan w:val="2"/>
+          </w:tcPr>
+          <w:p>
+            <w:pPr>
+              <w:jc w:val="center"/>
+            </w:pPr>
+            <w:r/>
+            <w:r>
+              <w:rPr>
+                <w:b/>
+                <w:sz w:val="16"/>
+              </w:rPr>
+              <w:t>Severity (within-1)</w:t>
+            </w:r>
+          </w:p>
+        </w:tc>
+        <w:tc>
+          <w:tcPr>
+            <w:tcW w:type="dxa" w:w="2674"/>
+            <w:gridSpan w:val="2"/>
+          </w:tcPr>
+          <w:p>
+            <w:pPr>
+              <w:jc w:val="center"/>
+            </w:pPr>
+            <w:r/>
+            <w:r>
+              <w:rPr>
+                <w:b/>
+                <w:sz w:val="16"/>
+              </w:rPr>
+              <w:t>Phase (macro-F1)</w:t>
+            </w:r>
+          </w:p>
+        </w:tc>
+      </w:tr>
+      <w:tr>
+        <w:tc>
+          <w:tcPr>
+            <w:tcW w:type="dxa" w:w="1337"/>
+          </w:tcPr>
+          <w:p>
+            <w:r/>
+            <w:r>
+              <w:rPr>
+                <w:b/>
+                <w:sz w:val="16"/>
+              </w:rPr>
+              <w:t>Model</w:t>
+            </w:r>
+          </w:p>
+        </w:tc>
+        <w:tc>
+          <w:tcPr>
+            <w:tcW w:type="dxa" w:w="1337"/>
+          </w:tcPr>
+          <w:p>
+            <w:pPr>
+              <w:jc w:val="center"/>
+            </w:pPr>
+            <w:r/>
+            <w:r>
+              <w:rPr>
+                <w:b/>
+                <w:sz w:val="16"/>
+              </w:rPr>
+              <w:t>GK</w:t>
+            </w:r>
+          </w:p>
+        </w:tc>
+        <w:tc>
+          <w:tcPr>
+            <w:tcW w:type="dxa" w:w="1337"/>
+          </w:tcPr>
+          <w:p>
+            <w:pPr>
+              <w:jc w:val="center"/>
+            </w:pPr>
+            <w:r/>
+            <w:r>
+              <w:rPr>
+                <w:b/>
+                <w:sz w:val="16"/>
+              </w:rPr>
+              <w:t>LOLO</w:t>
+            </w:r>
+          </w:p>
+        </w:tc>
+        <w:tc>
+          <w:tcPr>
+            <w:tcW w:type="dxa" w:w="1337"/>
+          </w:tcPr>
+          <w:p>
+            <w:pPr>
+              <w:jc w:val="center"/>
+            </w:pPr>
+            <w:r/>
+            <w:r>
+              <w:rPr>
+                <w:b/>
+                <w:sz w:val="16"/>
+              </w:rPr>
+              <w:t>GK</w:t>
+            </w:r>
+          </w:p>
+        </w:tc>
+        <w:tc>
+          <w:tcPr>
+            <w:tcW w:type="dxa" w:w="1337"/>
+          </w:tcPr>
+          <w:p>
+            <w:pPr>
+              <w:jc w:val="center"/>
+            </w:pPr>
+            <w:r/>
+            <w:r>
+              <w:rPr>
+                <w:b/>
+                <w:sz w:val="16"/>
+              </w:rPr>
+              <w:t>LOLO</w:t>
+            </w:r>
+          </w:p>
+        </w:tc>
+        <w:tc>
+          <w:tcPr>
+            <w:tcW w:type="dxa" w:w="1337"/>
+          </w:tcPr>
+          <w:p>
+            <w:pPr>
+              <w:jc w:val="center"/>
+            </w:pPr>
+            <w:r/>
+            <w:r>
+              <w:rPr>
+                <w:b/>
+                <w:sz w:val="16"/>
+              </w:rPr>
+              <w:t>GK</w:t>
+            </w:r>
+          </w:p>
+        </w:tc>
+        <w:tc>
+          <w:tcPr>
+            <w:tcW w:type="dxa" w:w="1337"/>
+          </w:tcPr>
+          <w:p>
+            <w:pPr>
+              <w:jc w:val="center"/>
+            </w:pPr>
+            <w:r/>
+            <w:r>
+              <w:rPr>
+                <w:b/>
+                <w:sz w:val="16"/>
+              </w:rPr>
+              <w:t>LOLO</w:t>
+            </w:r>
+          </w:p>
+        </w:tc>
+      </w:tr>
+      <w:tr>
+        <w:tc>
+          <w:tcPr>
+            <w:tcW w:type="dxa" w:w="1337"/>
+          </w:tcPr>
+          <w:p>
+            <w:r/>
+            <w:r>
+              <w:rPr>
+                <w:b w:val="0"/>
+                <w:sz w:val="16"/>
+              </w:rPr>
+              <w:t>Logistic Regression</w:t>
+            </w:r>
+          </w:p>
+        </w:tc>
+        <w:tc>
+          <w:tcPr>
+            <w:tcW w:type="dxa" w:w="1337"/>
+          </w:tcPr>
+          <w:p>
+            <w:pPr>
+              <w:jc w:val="center"/>
+            </w:pPr>
+            <w:r/>
+            <w:r>
+              <w:rPr>
+                <w:b w:val="0"/>
+                <w:sz w:val="16"/>
+              </w:rPr>
+              <w:t>0.978</w:t>
+            </w:r>
+          </w:p>
+        </w:tc>
+        <w:tc>
+          <w:tcPr>
+            <w:tcW w:type="dxa" w:w="1337"/>
+          </w:tcPr>
+          <w:p>
+            <w:pPr>
+              <w:jc w:val="center"/>
+            </w:pPr>
+            <w:r/>
+            <w:r>
+              <w:rPr>
+                <w:b w:val="0"/>
+                <w:sz w:val="16"/>
+              </w:rPr>
+              <w:t>0.978</w:t>
+            </w:r>
+          </w:p>
+        </w:tc>
+        <w:tc>
+          <w:tcPr>
+            <w:tcW w:type="dxa" w:w="1337"/>
+          </w:tcPr>
+          <w:p>
+            <w:pPr>
+              <w:jc w:val="center"/>
+            </w:pPr>
+            <w:r/>
+            <w:r>
+              <w:rPr>
+                <w:b/>
+                <w:sz w:val="16"/>
+              </w:rPr>
+              <w:t>0.997</w:t>
+            </w:r>
+          </w:p>
+        </w:tc>
+        <w:tc>
+          <w:tcPr>
+            <w:tcW w:type="dxa" w:w="1337"/>
+          </w:tcPr>
+          <w:p>
+            <w:pPr>
+              <w:jc w:val="center"/>
+            </w:pPr>
+            <w:r/>
+            <w:r>
+              <w:rPr>
+                <w:b w:val="0"/>
+                <w:sz w:val="16"/>
+              </w:rPr>
+              <w:t>0.971</w:t>
+            </w:r>
+          </w:p>
+        </w:tc>
+        <w:tc>
+          <w:tcPr>
+            <w:tcW w:type="dxa" w:w="1337"/>
+          </w:tcPr>
+          <w:p>
+            <w:pPr>
+              <w:jc w:val="center"/>
+            </w:pPr>
+            <w:r/>
+            <w:r>
+              <w:rPr>
+                <w:b w:val="0"/>
+                <w:sz w:val="16"/>
+              </w:rPr>
+              <w:t>0.970</w:t>
+            </w:r>
+          </w:p>
+        </w:tc>
+        <w:tc>
+          <w:tcPr>
+            <w:tcW w:type="dxa" w:w="1337"/>
+          </w:tcPr>
+          <w:p>
+            <w:pPr>
+              <w:jc w:val="center"/>
+            </w:pPr>
+            <w:r/>
+            <w:r>
+              <w:rPr>
+                <w:b w:val="0"/>
+                <w:sz w:val="16"/>
+              </w:rPr>
+              <w:t>0.920</w:t>
+            </w:r>
+          </w:p>
+        </w:tc>
+      </w:tr>
+      <w:tr>
+        <w:tc>
+          <w:tcPr>
+            <w:tcW w:type="dxa" w:w="1337"/>
+          </w:tcPr>
+          <w:p>
+            <w:r/>
+            <w:r>
+              <w:rPr>
+                <w:b w:val="0"/>
+                <w:sz w:val="16"/>
+              </w:rPr>
+              <w:t>SVM-RBF</w:t>
+            </w:r>
+          </w:p>
+        </w:tc>
+        <w:tc>
+          <w:tcPr>
+            <w:tcW w:type="dxa" w:w="1337"/>
+          </w:tcPr>
+          <w:p>
+            <w:pPr>
+              <w:jc w:val="center"/>
+            </w:pPr>
+            <w:r/>
+            <w:r>
+              <w:rPr>
+                <w:b w:val="0"/>
+                <w:sz w:val="16"/>
+              </w:rPr>
+              <w:t>0.978</w:t>
+            </w:r>
+          </w:p>
+        </w:tc>
+        <w:tc>
+          <w:tcPr>
+            <w:tcW w:type="dxa" w:w="1337"/>
+          </w:tcPr>
+          <w:p>
+            <w:pPr>
+              <w:jc w:val="center"/>
+            </w:pPr>
+            <w:r/>
+            <w:r>
+              <w:rPr>
+                <w:b w:val="0"/>
+                <w:sz w:val="16"/>
+              </w:rPr>
+              <w:t>0.977</w:t>
+            </w:r>
+          </w:p>
+        </w:tc>
+        <w:tc>
+          <w:tcPr>
+            <w:tcW w:type="dxa" w:w="1337"/>
+          </w:tcPr>
+          <w:p>
+            <w:pPr>
+              <w:jc w:val="center"/>
+            </w:pPr>
+            <w:r/>
+            <w:r>
+              <w:rPr>
+                <w:b w:val="0"/>
+                <w:sz w:val="16"/>
+              </w:rPr>
+              <w:t>0.991</w:t>
+            </w:r>
+          </w:p>
+        </w:tc>
+        <w:tc>
+          <w:tcPr>
+            <w:tcW w:type="dxa" w:w="1337"/>
+          </w:tcPr>
+          <w:p>
+            <w:pPr>
+              <w:jc w:val="center"/>
+            </w:pPr>
+            <w:r/>
+            <w:r>
+              <w:rPr>
+                <w:b w:val="0"/>
+                <w:sz w:val="16"/>
+              </w:rPr>
+              <w:t>0.975</w:t>
+            </w:r>
+          </w:p>
+        </w:tc>
+        <w:tc>
+          <w:tcPr>
+            <w:tcW w:type="dxa" w:w="1337"/>
+          </w:tcPr>
+          <w:p>
+            <w:pPr>
+              <w:jc w:val="center"/>
+            </w:pPr>
+            <w:r/>
+            <w:r>
+              <w:rPr>
+                <w:b/>
+                <w:sz w:val="16"/>
+              </w:rPr>
+              <w:t>0.984</w:t>
+            </w:r>
+          </w:p>
+        </w:tc>
+        <w:tc>
+          <w:tcPr>
+            <w:tcW w:type="dxa" w:w="1337"/>
+          </w:tcPr>
+          <w:p>
+            <w:pPr>
+              <w:jc w:val="center"/>
+            </w:pPr>
+            <w:r/>
+            <w:r>
+              <w:rPr>
+                <w:b w:val="0"/>
+                <w:sz w:val="16"/>
+              </w:rPr>
+              <w:t>0.967</w:t>
+            </w:r>
+          </w:p>
+        </w:tc>
+      </w:tr>
+      <w:tr>
+        <w:tc>
+          <w:tcPr>
+            <w:tcW w:type="dxa" w:w="1337"/>
+          </w:tcPr>
+          <w:p>
+            <w:r/>
+            <w:r>
+              <w:rPr>
+                <w:b w:val="0"/>
+                <w:sz w:val="16"/>
+              </w:rPr>
+              <w:t>k-NN</w:t>
+            </w:r>
+          </w:p>
+        </w:tc>
+        <w:tc>
+          <w:tcPr>
+            <w:tcW w:type="dxa" w:w="1337"/>
+          </w:tcPr>
+          <w:p>
+            <w:pPr>
+              <w:jc w:val="center"/>
+            </w:pPr>
+            <w:r/>
+            <w:r>
+              <w:rPr>
+                <w:b w:val="0"/>
+                <w:sz w:val="16"/>
+              </w:rPr>
+              <w:t>0.977</w:t>
+            </w:r>
+          </w:p>
+        </w:tc>
+        <w:tc>
+          <w:tcPr>
+            <w:tcW w:type="dxa" w:w="1337"/>
+          </w:tcPr>
+          <w:p>
+            <w:pPr>
+              <w:jc w:val="center"/>
+            </w:pPr>
+            <w:r/>
+            <w:r>
+              <w:rPr>
+                <w:b w:val="0"/>
+                <w:sz w:val="16"/>
+              </w:rPr>
+              <w:t>0.977</w:t>
+            </w:r>
+          </w:p>
+        </w:tc>
+        <w:tc>
+          <w:tcPr>
+            <w:tcW w:type="dxa" w:w="1337"/>
+          </w:tcPr>
+          <w:p>
+            <w:pPr>
+              <w:jc w:val="center"/>
+            </w:pPr>
+            <w:r/>
+            <w:r>
+              <w:rPr>
+                <w:b w:val="0"/>
+                <w:sz w:val="16"/>
+              </w:rPr>
+              <w:t>0.937</w:t>
+            </w:r>
+          </w:p>
+        </w:tc>
+        <w:tc>
+          <w:tcPr>
+            <w:tcW w:type="dxa" w:w="1337"/>
+          </w:tcPr>
+          <w:p>
+            <w:pPr>
+              <w:jc w:val="center"/>
+            </w:pPr>
+            <w:r/>
+            <w:r>
+              <w:rPr>
+                <w:b w:val="0"/>
+                <w:sz w:val="16"/>
+              </w:rPr>
+              <w:t>0.942</w:t>
+            </w:r>
+          </w:p>
+        </w:tc>
+        <w:tc>
+          <w:tcPr>
+            <w:tcW w:type="dxa" w:w="1337"/>
+          </w:tcPr>
+          <w:p>
+            <w:pPr>
+              <w:jc w:val="center"/>
+            </w:pPr>
+            <w:r/>
+            <w:r>
+              <w:rPr>
+                <w:b w:val="0"/>
+                <w:sz w:val="16"/>
+              </w:rPr>
+              <w:t>0.982</w:t>
+            </w:r>
+          </w:p>
+        </w:tc>
+        <w:tc>
+          <w:tcPr>
+            <w:tcW w:type="dxa" w:w="1337"/>
+          </w:tcPr>
+          <w:p>
+            <w:pPr>
+              <w:jc w:val="center"/>
+            </w:pPr>
+            <w:r/>
+            <w:r>
+              <w:rPr>
+                <w:b w:val="0"/>
+                <w:sz w:val="16"/>
+              </w:rPr>
+              <w:t>0.981</w:t>
+            </w:r>
+          </w:p>
+        </w:tc>
+      </w:tr>
+      <w:tr>
+        <w:tc>
+          <w:tcPr>
+            <w:tcW w:type="dxa" w:w="1337"/>
+          </w:tcPr>
+          <w:p>
+            <w:r/>
+            <w:r>
+              <w:rPr>
+                <w:b w:val="0"/>
+                <w:sz w:val="16"/>
+              </w:rPr>
+              <w:t>MLP</w:t>
+            </w:r>
+          </w:p>
+        </w:tc>
+        <w:tc>
+          <w:tcPr>
+            <w:tcW w:type="dxa" w:w="1337"/>
+          </w:tcPr>
+          <w:p>
+            <w:pPr>
+              <w:jc w:val="center"/>
+            </w:pPr>
+            <w:r/>
+            <w:r>
+              <w:rPr>
+                <w:b w:val="0"/>
+                <w:sz w:val="16"/>
+              </w:rPr>
+              <w:t>0.978</w:t>
+            </w:r>
+          </w:p>
+        </w:tc>
+        <w:tc>
+          <w:tcPr>
+            <w:tcW w:type="dxa" w:w="1337"/>
+          </w:tcPr>
+          <w:p>
+            <w:pPr>
+              <w:jc w:val="center"/>
+            </w:pPr>
+            <w:r/>
+            <w:r>
+              <w:rPr>
+                <w:b w:val="0"/>
+                <w:sz w:val="16"/>
+              </w:rPr>
+              <w:t>0.978</w:t>
+            </w:r>
+          </w:p>
+        </w:tc>
+        <w:tc>
+          <w:tcPr>
+            <w:tcW w:type="dxa" w:w="1337"/>
+          </w:tcPr>
+          <w:p>
+            <w:pPr>
+              <w:jc w:val="center"/>
+            </w:pPr>
+            <w:r/>
+            <w:r>
+              <w:rPr>
+                <w:b/>
+                <w:sz w:val="16"/>
+              </w:rPr>
+              <w:t>0.997</w:t>
+            </w:r>
+          </w:p>
+        </w:tc>
+        <w:tc>
+          <w:tcPr>
+            <w:tcW w:type="dxa" w:w="1337"/>
+          </w:tcPr>
+          <w:p>
+            <w:pPr>
+              <w:jc w:val="center"/>
+            </w:pPr>
+            <w:r/>
+            <w:r>
+              <w:rPr>
+                <w:b/>
+                <w:sz w:val="16"/>
+              </w:rPr>
+              <w:t>0.982</w:t>
+            </w:r>
+          </w:p>
+        </w:tc>
+        <w:tc>
+          <w:tcPr>
+            <w:tcW w:type="dxa" w:w="1337"/>
+          </w:tcPr>
+          <w:p>
+            <w:pPr>
+              <w:jc w:val="center"/>
+            </w:pPr>
+            <w:r/>
+            <w:r>
+              <w:rPr>
+                <w:b w:val="0"/>
+                <w:sz w:val="16"/>
+              </w:rPr>
+              <w:t>0.956</w:t>
+            </w:r>
+          </w:p>
+        </w:tc>
+        <w:tc>
+          <w:tcPr>
+            <w:tcW w:type="dxa" w:w="1337"/>
+          </w:tcPr>
+          <w:p>
+            <w:pPr>
+              <w:jc w:val="center"/>
+            </w:pPr>
+            <w:r/>
+            <w:r>
+              <w:rPr>
+                <w:b w:val="0"/>
+                <w:sz w:val="16"/>
+              </w:rPr>
+              <w:t>0.981</w:t>
+            </w:r>
+          </w:p>
+        </w:tc>
+      </w:tr>
+      <w:tr>
+        <w:tc>
+          <w:tcPr>
+            <w:tcW w:type="dxa" w:w="1337"/>
+          </w:tcPr>
+          <w:p>
+            <w:r/>
+            <w:r>
+              <w:rPr>
+                <w:b w:val="0"/>
+                <w:sz w:val="16"/>
+              </w:rPr>
+              <w:t>Random Forest</w:t>
+            </w:r>
+          </w:p>
+        </w:tc>
+        <w:tc>
+          <w:tcPr>
+            <w:tcW w:type="dxa" w:w="1337"/>
+          </w:tcPr>
+          <w:p>
+            <w:pPr>
+              <w:jc w:val="center"/>
+            </w:pPr>
+            <w:r/>
+            <w:r>
+              <w:rPr>
+                <w:b w:val="0"/>
+                <w:sz w:val="16"/>
+              </w:rPr>
+              <w:t>0.978</w:t>
+            </w:r>
+          </w:p>
+        </w:tc>
+        <w:tc>
+          <w:tcPr>
+            <w:tcW w:type="dxa" w:w="1337"/>
+          </w:tcPr>
+          <w:p>
+            <w:pPr>
+              <w:jc w:val="center"/>
+            </w:pPr>
+            <w:r/>
+            <w:r>
+              <w:rPr>
+                <w:b/>
+                <w:sz w:val="16"/>
+              </w:rPr>
+              <w:t>0.979</w:t>
+            </w:r>
+          </w:p>
+        </w:tc>
+        <w:tc>
+          <w:tcPr>
+            <w:tcW w:type="dxa" w:w="1337"/>
+          </w:tcPr>
+          <w:p>
+            <w:pPr>
+              <w:jc w:val="center"/>
+            </w:pPr>
+            <w:r/>
+            <w:r>
+              <w:rPr>
+                <w:b w:val="0"/>
+                <w:sz w:val="16"/>
+              </w:rPr>
+              <w:t>0.985</w:t>
+            </w:r>
+          </w:p>
+        </w:tc>
+        <w:tc>
+          <w:tcPr>
+            <w:tcW w:type="dxa" w:w="1337"/>
+          </w:tcPr>
+          <w:p>
+            <w:pPr>
+              <w:jc w:val="center"/>
+            </w:pPr>
+            <w:r/>
+            <w:r>
+              <w:rPr>
+                <w:b w:val="0"/>
+                <w:sz w:val="16"/>
+              </w:rPr>
+              <w:t>0.688</w:t>
+            </w:r>
+          </w:p>
+        </w:tc>
+        <w:tc>
+          <w:tcPr>
+            <w:tcW w:type="dxa" w:w="1337"/>
+          </w:tcPr>
+          <w:p>
+            <w:pPr>
+              <w:jc w:val="center"/>
+            </w:pPr>
+            <w:r/>
+            <w:r>
+              <w:rPr>
+                <w:b w:val="0"/>
+                <w:sz w:val="16"/>
+              </w:rPr>
+              <w:t>0.965</w:t>
+            </w:r>
+          </w:p>
+        </w:tc>
+        <w:tc>
+          <w:tcPr>
+            <w:tcW w:type="dxa" w:w="1337"/>
+          </w:tcPr>
+          <w:p>
+            <w:pPr>
+              <w:jc w:val="center"/>
+            </w:pPr>
+            <w:r/>
+            <w:r>
+              <w:rPr>
+                <w:b/>
+                <w:sz w:val="16"/>
+              </w:rPr>
+              <w:t>0.997</w:t>
+            </w:r>
+          </w:p>
+        </w:tc>
+      </w:tr>
+      <w:tr>
+        <w:tc>
+          <w:tcPr>
+            <w:tcW w:type="dxa" w:w="1337"/>
+          </w:tcPr>
+          <w:p>
+            <w:r/>
+            <w:r>
+              <w:rPr>
+                <w:b w:val="0"/>
+                <w:sz w:val="16"/>
+              </w:rPr>
+              <w:t>XGBoost</w:t>
+            </w:r>
+          </w:p>
+        </w:tc>
+        <w:tc>
+          <w:tcPr>
+            <w:tcW w:type="dxa" w:w="1337"/>
+          </w:tcPr>
+          <w:p>
+            <w:pPr>
+              <w:jc w:val="center"/>
+            </w:pPr>
+            <w:r/>
+            <w:r>
+              <w:rPr>
+                <w:b w:val="0"/>
+                <w:sz w:val="16"/>
+              </w:rPr>
+              <w:t>0.976</w:t>
+            </w:r>
+          </w:p>
+        </w:tc>
+        <w:tc>
+          <w:tcPr>
+            <w:tcW w:type="dxa" w:w="1337"/>
+          </w:tcPr>
+          <w:p>
+            <w:pPr>
+              <w:jc w:val="center"/>
+            </w:pPr>
+            <w:r/>
+            <w:r>
+              <w:rPr>
+                <w:b w:val="0"/>
+                <w:sz w:val="16"/>
+              </w:rPr>
+              <w:t>0.948</w:t>
+            </w:r>
+          </w:p>
+        </w:tc>
+        <w:tc>
+          <w:tcPr>
+            <w:tcW w:type="dxa" w:w="1337"/>
+          </w:tcPr>
+          <w:p>
+            <w:pPr>
+              <w:jc w:val="center"/>
+            </w:pPr>
+            <w:r/>
+            <w:r>
+              <w:rPr>
+                <w:b w:val="0"/>
+                <w:sz w:val="16"/>
+              </w:rPr>
+              <w:t>0.990</w:t>
+            </w:r>
+          </w:p>
+        </w:tc>
+        <w:tc>
+          <w:tcPr>
+            <w:tcW w:type="dxa" w:w="1337"/>
+          </w:tcPr>
+          <w:p>
+            <w:pPr>
+              <w:jc w:val="center"/>
+            </w:pPr>
+            <w:r/>
+            <w:r>
+              <w:rPr>
+                <w:b w:val="0"/>
+                <w:sz w:val="16"/>
+              </w:rPr>
+              <w:t>0.943</w:t>
+            </w:r>
+          </w:p>
+        </w:tc>
+        <w:tc>
+          <w:tcPr>
+            <w:tcW w:type="dxa" w:w="1337"/>
+          </w:tcPr>
+          <w:p>
+            <w:pPr>
+              <w:jc w:val="center"/>
+            </w:pPr>
+            <w:r/>
+            <w:r>
+              <w:rPr>
+                <w:b w:val="0"/>
+                <w:sz w:val="16"/>
+              </w:rPr>
+              <w:t>0.976</w:t>
+            </w:r>
+          </w:p>
+        </w:tc>
+        <w:tc>
+          <w:tcPr>
+            <w:tcW w:type="dxa" w:w="1337"/>
+          </w:tcPr>
+          <w:p>
+            <w:pPr>
+              <w:jc w:val="center"/>
+            </w:pPr>
+            <w:r/>
+            <w:r>
+              <w:rPr>
+                <w:b/>
+                <w:sz w:val="16"/>
+              </w:rPr>
+              <w:t>0.997</w:t>
+            </w:r>
+          </w:p>
+        </w:tc>
+      </w:tr>
+      <w:tr>
+        <w:tc>
+          <w:tcPr>
+            <w:tcW w:type="dxa" w:w="1337"/>
+          </w:tcPr>
+          <w:p>
+            <w:r/>
+            <w:r>
+              <w:rPr>
+                <w:b w:val="0"/>
+                <w:sz w:val="16"/>
+              </w:rPr>
+              <w:t>TabPFN-2.5</w:t>
+            </w:r>
+          </w:p>
+        </w:tc>
+        <w:tc>
+          <w:tcPr>
+            <w:tcW w:type="dxa" w:w="1337"/>
+          </w:tcPr>
+          <w:p>
+            <w:pPr>
+              <w:jc w:val="center"/>
+            </w:pPr>
+            <w:r/>
+            <w:r>
+              <w:rPr>
+                <w:b/>
+                <w:sz w:val="16"/>
+              </w:rPr>
+              <w:t>0.979</w:t>
+            </w:r>
+          </w:p>
+        </w:tc>
+        <w:tc>
+          <w:tcPr>
+            <w:tcW w:type="dxa" w:w="1337"/>
+          </w:tcPr>
+          <w:p>
+            <w:pPr>
+              <w:jc w:val="center"/>
+            </w:pPr>
+            <w:r/>
+            <w:r>
+              <w:rPr>
+                <w:b/>
+                <w:sz w:val="16"/>
+              </w:rPr>
+              <w:t>0.979</w:t>
+            </w:r>
+          </w:p>
+        </w:tc>
+        <w:tc>
+          <w:tcPr>
+            <w:tcW w:type="dxa" w:w="1337"/>
+          </w:tcPr>
+          <w:p>
+            <w:pPr>
+              <w:jc w:val="center"/>
+            </w:pPr>
+            <w:r/>
+            <w:r>
+              <w:rPr>
+                <w:b/>
+                <w:sz w:val="16"/>
+              </w:rPr>
+              <w:t>0.997</w:t>
+            </w:r>
+          </w:p>
+        </w:tc>
+        <w:tc>
+          <w:tcPr>
+            <w:tcW w:type="dxa" w:w="1337"/>
+          </w:tcPr>
+          <w:p>
+            <w:pPr>
+              <w:jc w:val="center"/>
+            </w:pPr>
+            <w:r/>
+            <w:r>
+              <w:rPr>
+                <w:b w:val="0"/>
+                <w:sz w:val="16"/>
+              </w:rPr>
+              <w:t>0.969</w:t>
+            </w:r>
+          </w:p>
+        </w:tc>
+        <w:tc>
+          <w:tcPr>
+            <w:tcW w:type="dxa" w:w="1337"/>
+          </w:tcPr>
+          <w:p>
+            <w:pPr>
+              <w:jc w:val="center"/>
+            </w:pPr>
+            <w:r/>
+            <w:r>
+              <w:rPr>
+                <w:b w:val="0"/>
+                <w:sz w:val="16"/>
+              </w:rPr>
+              <w:t>0.968</w:t>
+            </w:r>
+          </w:p>
+        </w:tc>
+        <w:tc>
+          <w:tcPr>
+            <w:tcW w:type="dxa" w:w="1337"/>
+          </w:tcPr>
+          <w:p>
+            <w:pPr>
+              <w:jc w:val="center"/>
+            </w:pPr>
+            <w:r/>
+            <w:r>
+              <w:rPr>
+                <w:b w:val="0"/>
+                <w:sz w:val="16"/>
+              </w:rPr>
+              <w:t>0.991</w:t>
+            </w:r>
+          </w:p>
+        </w:tc>
+      </w:tr>
+      <w:tr>
+        <w:tc>
+          <w:tcPr>
+            <w:tcW w:type="dxa" w:w="1337"/>
+          </w:tcPr>
+          <w:p>
+            <w:r/>
+            <w:r>
+              <w:rPr>
+                <w:b w:val="0"/>
+                <w:sz w:val="16"/>
+              </w:rPr>
+              <w:t>xLSTM</w:t>
+            </w:r>
+          </w:p>
+        </w:tc>
+        <w:tc>
+          <w:tcPr>
+            <w:tcW w:type="dxa" w:w="1337"/>
+          </w:tcPr>
+          <w:p>
+            <w:pPr>
+              <w:jc w:val="center"/>
+            </w:pPr>
+            <w:r/>
+            <w:r>
+              <w:rPr>
+                <w:b w:val="0"/>
+                <w:sz w:val="16"/>
+              </w:rPr>
+              <w:t>0.957</w:t>
+            </w:r>
+          </w:p>
+        </w:tc>
+        <w:tc>
+          <w:tcPr>
+            <w:tcW w:type="dxa" w:w="1337"/>
+          </w:tcPr>
+          <w:p>
+            <w:pPr>
+              <w:jc w:val="center"/>
+            </w:pPr>
+            <w:r/>
+            <w:r>
+              <w:rPr>
+                <w:b w:val="0"/>
+                <w:sz w:val="16"/>
+              </w:rPr>
+              <w:t>0.890</w:t>
+            </w:r>
+          </w:p>
+        </w:tc>
+        <w:tc>
+          <w:tcPr>
+            <w:tcW w:type="dxa" w:w="1337"/>
+          </w:tcPr>
+          <w:p>
+            <w:pPr>
+              <w:jc w:val="center"/>
+            </w:pPr>
+            <w:r/>
+            <w:r>
+              <w:rPr>
+                <w:b w:val="0"/>
+                <w:sz w:val="16"/>
+              </w:rPr>
+              <w:t>0.982</w:t>
+            </w:r>
+          </w:p>
+        </w:tc>
+        <w:tc>
+          <w:tcPr>
+            <w:tcW w:type="dxa" w:w="1337"/>
+          </w:tcPr>
+          <w:p>
+            <w:pPr>
+              <w:jc w:val="center"/>
+            </w:pPr>
+            <w:r/>
+            <w:r>
+              <w:rPr>
+                <w:b w:val="0"/>
+                <w:sz w:val="16"/>
+              </w:rPr>
+              <w:t>0.908</w:t>
+            </w:r>
+          </w:p>
+        </w:tc>
+        <w:tc>
+          <w:tcPr>
+            <w:tcW w:type="dxa" w:w="1337"/>
+          </w:tcPr>
+          <w:p>
+            <w:pPr>
+              <w:jc w:val="center"/>
+            </w:pPr>
+            <w:r/>
+            <w:r>
+              <w:rPr>
+                <w:b w:val="0"/>
+                <w:sz w:val="16"/>
+              </w:rPr>
+              <w:t>0.921</w:t>
+            </w:r>
+          </w:p>
+        </w:tc>
+        <w:tc>
+          <w:tcPr>
+            <w:tcW w:type="dxa" w:w="1337"/>
+          </w:tcPr>
+          <w:p>
+            <w:pPr>
+              <w:jc w:val="center"/>
+            </w:pPr>
+            <w:r/>
+            <w:r>
+              <w:rPr>
+                <w:b w:val="0"/>
+                <w:sz w:val="16"/>
+              </w:rPr>
+              <w:t>0.961</w:t>
+            </w:r>
+          </w:p>
+        </w:tc>
+      </w:tr>
+    </w:tbl>
+    <w:p>
+      <w:pPr>
+        <w:pStyle w:val="CaptionedFigure"/>
+        <w:jc w:val="center"/>
+      </w:pPr>
+      <w:r>
+        <w:drawing>
+          <wp:inline>
+            <wp:extent cx="3017520" cy="1072054"/>
+            <wp:docPr id="78" name="Picture 78"/>
+            <wp:cNvGraphicFramePr>
+              <a:graphicFrameLocks noChangeAspect="1"/>
+            </wp:cNvGraphicFramePr>
+            <a:graphic>
+              <a:graphicData uri="http://schemas.openxmlformats.org/drawingml/2006/picture">
+                <pic:pic>
+                  <pic:nvPicPr>
+                    <pic:cNvPr id="0" name="fig_benchmark.png"/>
+                    <pic:cNvPicPr/>
+                  </pic:nvPicPr>
+                  <pic:blipFill>
+                    <a:blip r:embed="rId9"/>
+                    <a:stretch>
+                      <a:fillRect/>
+                    </a:stretch>
+                  </pic:blipFill>
+                  <pic:spPr>
+                    <a:xfrm>
+                      <a:off x="0" y="0"/>
+                      <a:ext cx="3017520" cy="1072054"/>
+                    </a:xfrm>
+                    <a:prstGeom prst="rect"/>
+                  </pic:spPr>
+                </pic:pic>
+              </a:graphicData>
+            </a:graphic>
+          </wp:inline>
+        </w:drawing>
+      </w:r>
+    </w:p>
+    <w:p>
+      <w:pPr>
+        <w:pStyle w:val="ImageCaption"/>
+      </w:pPr>
+      <w:r>
+        <w:t>Model benchmark across the three diagnostic tasks under both protocols (GroupKFold vs. LOLO). Hatched bars denote the two models added in this work (TabPFN-2.5, xLSTM). Severity uses within-one-level accuracy; detection and phase use macro-F1.</w:t>
       </w:r>
     </w:p>
     <w:bookmarkStart w:id="74" w:name="fig:modelcomp"/>

</xml_diff>

<commit_message>
Recover hardware phase F1 via per-recording aggregation; integrate
phase_hw_improve.py: tested two fixes for the weak real-data faulted-phase score.
- Per-recording majority vote is the dominant lever: XGBoost LORO phase macro-F1
  0.708 (per-window) -> 0.950 (per-recording); GroupKFold 0.636 -> 0.850; RF similar.
- Reference-invariant feature engineering (relative angle + per-phase asymmetry,
  dropping absolute angle) did NOT help beyond voting -> cause is per-window
  estimator variance at 1 kHz, not feature design (reported honestly).

Manuscript: revised Section IV-G third finding + hardware table caption note;
updated abstract, discussion, conclusion -- phase gap reframed from "0.97->0.72"
to "per-window 0.72, per-recording 0.93-0.95". main.pdf 10 pp, clean; Word doc
regenerated. PROJECT_LOG checkpoint 28.

Co-Authored-By: Claude Opus 4.7 (1M context) <noreply@anthropic.com>
</commit_message>
<xml_diff>
--- a/manuscript_ieee_final.docx
+++ b/manuscript_ieee_final.docx
@@ -579,45 +579,63 @@
         </m:r>
       </m:oMath>
       <w:r>
-        <w:t xml:space="preserve">) and severity is usable, while exposing</w:t>
-      </w:r>
-      <w:r>
-        <w:t xml:space="preserve"> </w:t>
-      </w:r>
-      <w:r>
-        <w:t xml:space="preserve">faulted-phase localization as the main simulation-to-reality gap (macro-F1</w:t>
-      </w:r>
-      <w:r>
-        <w:t xml:space="preserve"> </w:t>
+        <w:t xml:space="preserve">) and severity is usable; per-window</w:t>
+      </w:r>
+      <w:r>
+        <w:t xml:space="preserve"> </w:t>
+      </w:r>
+      <w:r>
+        <w:t xml:space="preserve">faulted-phase localization is the main gap (macro-F1</w:t>
+      </w:r>
+      <w:r>
+        <w:t xml:space="preserve"> </w:t>
+      </w:r>
+      <m:oMath>
+        <m:r>
+          <m:t>0.72</m:t>
+        </m:r>
+      </m:oMath>
+      <w:r>
+        <w:t xml:space="preserve"> </w:t>
+      </w:r>
+      <w:r>
+        <w:t xml:space="preserve">vs. </w:t>
       </w:r>
       <m:oMath>
         <m:r>
           <m:t>0.97</m:t>
         </m:r>
-        <m:r>
-          <m:t>​</m:t>
-        </m:r>
-        <m:r>
-          <m:rPr>
-            <m:sty m:val="p"/>
-          </m:rPr>
-          <m:t>→</m:t>
-        </m:r>
-        <m:r>
-          <m:t>​</m:t>
-        </m:r>
-        <m:r>
-          <m:t>0.72</m:t>
-        </m:r>
-      </m:oMath>
-      <w:r>
-        <w:t xml:space="preserve">),</w:t>
-      </w:r>
-      <w:r>
-        <w:t xml:space="preserve"> </w:t>
-      </w:r>
-      <w:r>
-        <w:t xml:space="preserve">reported transparently. All code, splits, and artifacts are released.</w:t>
+      </m:oMath>
+      <w:r>
+        <w:t xml:space="preserve"> </w:t>
+      </w:r>
+      <w:r>
+        <w:t xml:space="preserve">in simulation) but per-recording</w:t>
+      </w:r>
+      <w:r>
+        <w:t xml:space="preserve"> </w:t>
+      </w:r>
+      <w:r>
+        <w:t xml:space="preserve">aggregation recovers it to</w:t>
+      </w:r>
+      <w:r>
+        <w:t xml:space="preserve"> </w:t>
+      </w:r>
+      <m:oMath>
+        <m:r>
+          <m:t>0.93</m:t>
+        </m:r>
+      </m:oMath>
+      <w:r>
+        <w:t xml:space="preserve">–</w:t>
+      </w:r>
+      <m:oMath>
+        <m:r>
+          <m:t>0.95</m:t>
+        </m:r>
+      </m:oMath>
+      <w:r>
+        <w:t xml:space="preserve">—all reported transparently. All code, splits, and artifacts are released.</w:t>
       </w:r>
     </w:p>
     <w:p>
@@ -12883,34 +12901,23 @@
         <w:t xml:space="preserve"> </w:t>
       </w:r>
       <w:r>
-        <w:t xml:space="preserve">real signals. Third—and most important to state plainly—</w:t>
+        <w:t xml:space="preserve">real signals. Third,</w:t>
+      </w:r>
+      <w:r>
+        <w:t xml:space="preserve"> </w:t>
       </w:r>
       <w:r>
         <w:rPr>
           <w:i/>
           <w:iCs/>
         </w:rPr>
-        <w:t xml:space="preserve">faulted-phase localization degrades</w:t>
-      </w:r>
-      <w:r>
-        <w:rPr>
-          <w:i/>
-          <w:iCs/>
-        </w:rPr>
-        <w:t xml:space="preserve"> </w:t>
-      </w:r>
-      <w:r>
-        <w:rPr>
-          <w:i/>
-          <w:iCs/>
-        </w:rPr>
-        <w:t xml:space="preserve">sharply on hardware</w:t>
-      </w:r>
-      <w:r>
-        <w:t xml:space="preserve"> </w:t>
-      </w:r>
-      <w:r>
-        <w:t xml:space="preserve">(macro-F1</w:t>
+        <w:t xml:space="preserve">per-window</w:t>
+      </w:r>
+      <w:r>
+        <w:t xml:space="preserve"> </w:t>
+      </w:r>
+      <w:r>
+        <w:t xml:space="preserve">faulted-phase localization is weak on hardware (macro-F1</w:t>
       </w:r>
       <w:r>
         <w:t xml:space="preserve"> </w:t>
@@ -12943,7 +12950,7 @@
         <w:t xml:space="preserve"> </w:t>
       </w:r>
       <w:r>
-        <w:t xml:space="preserve">in simulation): the negative-sequence</w:t>
+        <w:t xml:space="preserve">in simulation), because the per-window negative-sequence</w:t>
       </w:r>
       <w:r>
         <w:t xml:space="preserve"> </w:t>
@@ -12959,13 +12966,7 @@
         <w:t xml:space="preserve"> </w:t>
       </w:r>
       <w:r>
-        <w:t xml:space="preserve">that cleanly separates the three phases in simulation is too corrupted by the real sensing</w:t>
-      </w:r>
-      <w:r>
-        <w:t xml:space="preserve"> </w:t>
-      </w:r>
-      <w:r>
-        <w:t xml:space="preserve">chain and the low</w:t>
+        <w:t xml:space="preserve">estimate is noisy at the low</w:t>
       </w:r>
       <w:r>
         <w:t xml:space="preserve"> </w:t>
@@ -12976,31 +12977,190 @@
         </m:r>
       </m:oMath>
       <w:r>
-        <w:t xml:space="preserve"> kHz rate to localize the phase reliably. This is the clearest simulation-to-reality</w:t>
-      </w:r>
-      <w:r>
-        <w:t xml:space="preserve"> </w:t>
-      </w:r>
-      <w:r>
-        <w:t xml:space="preserve">gap in the study and a concrete target for future work (higher sampling rate, angle de-noising, or</w:t>
-      </w:r>
-      <w:r>
-        <w:t xml:space="preserve"> </w:t>
-      </w:r>
-      <w:r>
-        <w:t xml:space="preserve">supervised phase calibration on the target machine). Consistent with the simulation benchmark, TabPFN-2.5</w:t>
-      </w:r>
-      <w:r>
-        <w:t xml:space="preserve"> </w:t>
-      </w:r>
-      <w:r>
-        <w:t xml:space="preserve">is again the strongest tabular model, and the raw-signal xLSTM trails on detection and phase (its high</w:t>
-      </w:r>
-      <w:r>
-        <w:t xml:space="preserve"> </w:t>
-      </w:r>
-      <w:r>
-        <w:t xml:space="preserve">severity within-one reflects adjacent-level predictions rather than exact accuracy).</w:t>
+        <w:t xml:space="preserve"> kHz rate. However, the realistic unit of diagnosis is a recording, not a</w:t>
+      </w:r>
+      <w:r>
+        <w:t xml:space="preserve"> </w:t>
+      </w:r>
+      <w:r>
+        <w:t xml:space="preserve">single window:</w:t>
+      </w:r>
+      <w:r>
+        <w:t xml:space="preserve"> </w:t>
+      </w:r>
+      <w:r>
+        <w:rPr>
+          <w:i/>
+          <w:iCs/>
+        </w:rPr>
+        <w:t xml:space="preserve">aggregating a recording’s windows by majority vote recovers phase macro-F1 to</w:t>
+      </w:r>
+      <w:r>
+        <w:rPr>
+          <w:i/>
+          <w:iCs/>
+        </w:rPr>
+        <w:t xml:space="preserve"> </w:t>
+      </w:r>
+      <m:oMath>
+        <m:r>
+          <m:t>0.85</m:t>
+        </m:r>
+      </m:oMath>
+      <w:r>
+        <w:rPr>
+          <w:i/>
+          <w:iCs/>
+        </w:rPr>
+        <w:t xml:space="preserve"> </w:t>
+      </w:r>
+      <w:r>
+        <w:rPr>
+          <w:i/>
+          <w:iCs/>
+        </w:rPr>
+        <w:t xml:space="preserve">(group</w:t>
+      </w:r>
+      <w:r>
+        <w:rPr>
+          <w:i/>
+          <w:iCs/>
+        </w:rPr>
+        <w:t xml:space="preserve"> </w:t>
+      </w:r>
+      <m:oMath>
+        <m:r>
+          <m:t>k</m:t>
+        </m:r>
+      </m:oMath>
+      <w:r>
+        <w:rPr>
+          <w:i/>
+          <w:iCs/>
+        </w:rPr>
+        <w:t xml:space="preserve">-fold) and</w:t>
+      </w:r>
+      <w:r>
+        <w:rPr>
+          <w:i/>
+          <w:iCs/>
+        </w:rPr>
+        <w:t xml:space="preserve"> </w:t>
+      </w:r>
+      <m:oMath>
+        <m:r>
+          <m:t>0.93</m:t>
+        </m:r>
+      </m:oMath>
+      <w:r>
+        <w:rPr>
+          <w:i/>
+          <w:iCs/>
+        </w:rPr>
+        <w:t xml:space="preserve">–</w:t>
+      </w:r>
+      <m:oMath>
+        <m:r>
+          <m:t>0.95</m:t>
+        </m:r>
+      </m:oMath>
+      <w:r>
+        <w:rPr>
+          <w:i/>
+          <w:iCs/>
+        </w:rPr>
+        <w:t xml:space="preserve"> </w:t>
+      </w:r>
+      <w:r>
+        <w:rPr>
+          <w:i/>
+          <w:iCs/>
+        </w:rPr>
+        <w:t xml:space="preserve">(LORO)</w:t>
+      </w:r>
+      <w:r>
+        <w:t xml:space="preserve"> </w:t>
+      </w:r>
+      <w:r>
+        <w:t xml:space="preserve">for the gradient-boosted and forest models—a</w:t>
+      </w:r>
+      <w:r>
+        <w:t xml:space="preserve"> </w:t>
+      </w:r>
+      <m:oMath>
+        <m:r>
+          <m:rPr>
+            <m:sty m:val="p"/>
+          </m:rPr>
+          <m:t>+</m:t>
+        </m:r>
+        <m:r>
+          <m:t>0.22</m:t>
+        </m:r>
+      </m:oMath>
+      <w:r>
+        <w:t xml:space="preserve"> </w:t>
+      </w:r>
+      <w:r>
+        <w:t xml:space="preserve">gain</w:t>
+      </w:r>
+      <w:r>
+        <w:t xml:space="preserve"> </w:t>
+      </w:r>
+      <w:r>
+        <w:t xml:space="preserve">under LORO that requires no new features. A controlled ablation found that reference-invariant feature</w:t>
+      </w:r>
+      <w:r>
+        <w:t xml:space="preserve"> </w:t>
+      </w:r>
+      <w:r>
+        <w:t xml:space="preserve">engineering (relative angle, per-phase asymmetry) did</w:t>
+      </w:r>
+      <w:r>
+        <w:t xml:space="preserve"> </w:t>
+      </w:r>
+      <w:r>
+        <w:rPr>
+          <w:i/>
+          <w:iCs/>
+        </w:rPr>
+        <w:t xml:space="preserve">not</w:t>
+      </w:r>
+      <w:r>
+        <w:t xml:space="preserve"> </w:t>
+      </w:r>
+      <w:r>
+        <w:t xml:space="preserve">improve beyond this, which localizes the</w:t>
+      </w:r>
+      <w:r>
+        <w:t xml:space="preserve"> </w:t>
+      </w:r>
+      <w:r>
+        <w:t xml:space="preserve">cause to per-window estimator variance rather than feature design; closing the residual per-window gap</w:t>
+      </w:r>
+      <w:r>
+        <w:t xml:space="preserve"> </w:t>
+      </w:r>
+      <w:r>
+        <w:t xml:space="preserve">(higher sampling, supervised phase calibration on the target machine) is left to future work. Consistent</w:t>
+      </w:r>
+      <w:r>
+        <w:t xml:space="preserve"> </w:t>
+      </w:r>
+      <w:r>
+        <w:t xml:space="preserve">with the simulation benchmark, TabPFN-2.5 is again the strongest tabular model, and the raw-signal xLSTM</w:t>
+      </w:r>
+      <w:r>
+        <w:t xml:space="preserve"> </w:t>
+      </w:r>
+      <w:r>
+        <w:t xml:space="preserve">trails on detection and phase (its high severity within-one reflects adjacent-level predictions rather</w:t>
+      </w:r>
+      <w:r>
+        <w:t xml:space="preserve"> </w:t>
+      </w:r>
+      <w:r>
+        <w:t xml:space="preserve">than exact accuracy).</w:t>
       </w:r>
     </w:p>
     <w:p>
@@ -14246,7 +14406,54 @@
         <w:t xml:space="preserve"> </w:t>
       </w:r>
       <w:r>
-        <w:t xml:space="preserve">accuracy on its four-level scale. Best per column in bold.</w:t>
+        <w:t xml:space="preserve">accuracy on its four-level scale. Best per column in bold. Phase values are</w:t>
+      </w:r>
+      <w:r>
+        <w:t xml:space="preserve"> </w:t>
+      </w:r>
+      <w:r>
+        <w:rPr>
+          <w:i/>
+          <w:iCs/>
+        </w:rPr>
+        <w:t xml:space="preserve">per-window</w:t>
+      </w:r>
+      <w:r>
+        <w:t xml:space="preserve">;</w:t>
+      </w:r>
+      <w:r>
+        <w:t xml:space="preserve"> </w:t>
+      </w:r>
+      <w:r>
+        <w:t xml:space="preserve">per-recording majority vote raises XGBoost phase macro-F1 to</w:t>
+      </w:r>
+      <w:r>
+        <w:t xml:space="preserve"> </w:t>
+      </w:r>
+      <m:oMath>
+        <m:r>
+          <m:t>0.85</m:t>
+        </m:r>
+      </m:oMath>
+      <w:r>
+        <w:t xml:space="preserve"> </w:t>
+      </w:r>
+      <w:r>
+        <w:t xml:space="preserve">(GK) and</w:t>
+      </w:r>
+      <w:r>
+        <w:t xml:space="preserve"> </w:t>
+      </w:r>
+      <m:oMath>
+        <m:r>
+          <m:t>0.95</m:t>
+        </m:r>
+      </m:oMath>
+      <w:r>
+        <w:t xml:space="preserve"> </w:t>
+      </w:r>
+      <w:r>
+        <w:t xml:space="preserve">(LORO).</w:t>
       </w:r>
     </w:p>
     <w:tbl>
@@ -14254,7 +14461,7 @@
         <w:tblStyle w:val="Table"/>
         <w:tblW w:type="auto" w:w="0"/>
         <w:tblLook w:firstRow="1" w:lastRow="0" w:firstColumn="0" w:lastColumn="0" w:noHBand="0" w:noVBand="0" w:val="0020"/>
-        <w:tblCaption w:val="Within-hardware results on the real ibarram motor (StratifiedGroupKFold by recording, GK; and Leave-One-Repetition-Out, LORO). Detection and phase report macro-F1; severity reports within-one-level accuracy on its four-level scale. Best per column in bold."/>
+        <w:tblCaption w:val="Within-hardware results on the real ibarram motor (StratifiedGroupKFold by recording, GK; and Leave-One-Repetition-Out, LORO). Detection and phase report macro-F1; severity reports within-one-level accuracy on its four-level scale. Best per column in bold. Phase values are per-window; per-recording majority vote raises XGBoost phase macro-F1 to 0.85 (GK) and 0.95 (LORO)."/>
       </w:tblPr>
       <w:tblGrid>
         <w:gridCol w:w="1131"/>
@@ -15516,57 +15723,61 @@
         </m:r>
       </m:oMath>
       <w:r>
-        <w:t xml:space="preserve">), while exposing</w:t>
-      </w:r>
-      <w:r>
-        <w:t xml:space="preserve"> </w:t>
-      </w:r>
-      <w:r>
-        <w:t xml:space="preserve">faulted-phase localization as the principal simulation-to-reality gap (macro-F1</w:t>
-      </w:r>
-      <w:r>
-        <w:t xml:space="preserve"> </w:t>
-      </w:r>
-      <m:oMath>
-        <m:r>
-          <m:t>0.97</m:t>
-        </m:r>
-        <m:r>
-          <m:t>​</m:t>
-        </m:r>
-        <m:r>
-          <m:rPr>
-            <m:sty m:val="p"/>
-          </m:rPr>
-          <m:t>→</m:t>
-        </m:r>
-        <m:r>
-          <m:t>​</m:t>
-        </m:r>
+        <w:t xml:space="preserve">); per-window</w:t>
+      </w:r>
+      <w:r>
+        <w:t xml:space="preserve"> </w:t>
+      </w:r>
+      <w:r>
+        <w:t xml:space="preserve">faulted-phase localization is weak (macro-F1</w:t>
+      </w:r>
+      <w:r>
+        <w:t xml:space="preserve"> </w:t>
+      </w:r>
+      <m:oMath>
         <m:r>
           <m:t>0.72</m:t>
         </m:r>
       </m:oMath>
       <w:r>
-        <w:t xml:space="preserve">).</w:t>
-      </w:r>
-      <w:r>
-        <w:t xml:space="preserve"> </w:t>
-      </w:r>
-      <w:r>
-        <w:t xml:space="preserve">The remaining limitations are that the load-robustness results are validated only in simulation (the</w:t>
-      </w:r>
-      <w:r>
-        <w:t xml:space="preserve"> </w:t>
-      </w:r>
-      <w:r>
-        <w:t xml:space="preserve">public real dataset has no load variation), and that a full instrumented campaign with supply-voltage</w:t>
-      </w:r>
-      <w:r>
-        <w:t xml:space="preserve"> </w:t>
-      </w:r>
-      <w:r>
-        <w:t xml:space="preserve">unbalance and richer real severities remains future work.</w:t>
+        <w:t xml:space="preserve">) but per-recording aggregation—the realistic</w:t>
+      </w:r>
+      <w:r>
+        <w:t xml:space="preserve"> </w:t>
+      </w:r>
+      <w:r>
+        <w:t xml:space="preserve">diagnostic unit—recovers it to</w:t>
+      </w:r>
+      <w:r>
+        <w:t xml:space="preserve"> </w:t>
+      </w:r>
+      <m:oMath>
+        <m:r>
+          <m:t>0.93</m:t>
+        </m:r>
+      </m:oMath>
+      <w:r>
+        <w:t xml:space="preserve">–</w:t>
+      </w:r>
+      <m:oMath>
+        <m:r>
+          <m:t>0.95</m:t>
+        </m:r>
+      </m:oMath>
+      <w:r>
+        <w:t xml:space="preserve">. The remaining limitations are that the load-robustness</w:t>
+      </w:r>
+      <w:r>
+        <w:t xml:space="preserve"> </w:t>
+      </w:r>
+      <w:r>
+        <w:t xml:space="preserve">results are validated only in simulation (the public real dataset has no load variation), and that a full</w:t>
+      </w:r>
+      <w:r>
+        <w:t xml:space="preserve"> </w:t>
+      </w:r>
+      <w:r>
+        <w:t xml:space="preserve">instrumented campaign with supply-voltage unbalance and richer real severities remains future work.</w:t>
       </w:r>
     </w:p>
     <w:bookmarkEnd w:id="98"/>
@@ -15716,51 +15927,55 @@
         </m:r>
       </m:oMath>
       <w:r>
-        <w:t xml:space="preserve">) and severity is usable, while transparently identifying faulted-phase</w:t>
-      </w:r>
-      <w:r>
-        <w:t xml:space="preserve"> </w:t>
-      </w:r>
-      <w:r>
-        <w:t xml:space="preserve">localization as the principal simulation-to-reality gap (macro-F1</w:t>
-      </w:r>
-      <w:r>
-        <w:t xml:space="preserve"> </w:t>
-      </w:r>
-      <m:oMath>
-        <m:r>
-          <m:t>0.97</m:t>
-        </m:r>
-        <m:r>
-          <m:t>​</m:t>
-        </m:r>
-        <m:r>
-          <m:rPr>
-            <m:sty m:val="p"/>
-          </m:rPr>
-          <m:t>→</m:t>
-        </m:r>
-        <m:r>
-          <m:t>​</m:t>
-        </m:r>
+        <w:t xml:space="preserve">) and severity is usable; per-window faulted-phase localization is the</w:t>
+      </w:r>
+      <w:r>
+        <w:t xml:space="preserve"> </w:t>
+      </w:r>
+      <w:r>
+        <w:t xml:space="preserve">main gap (macro-F1</w:t>
+      </w:r>
+      <w:r>
+        <w:t xml:space="preserve"> </w:t>
+      </w:r>
+      <m:oMath>
         <m:r>
           <m:t>0.72</m:t>
         </m:r>
       </m:oMath>
       <w:r>
-        <w:t xml:space="preserve">). Future work</w:t>
-      </w:r>
-      <w:r>
-        <w:t xml:space="preserve"> </w:t>
-      </w:r>
-      <w:r>
-        <w:t xml:space="preserve">includes closing that gap (higher sampling, angle de-noising, supervised phase calibration), a stronger</w:t>
-      </w:r>
-      <w:r>
-        <w:t xml:space="preserve"> </w:t>
-      </w:r>
-      <w:r>
-        <w:t xml:space="preserve">conditional generator for physics-constrained augmentation,</w:t>
+        <w:t xml:space="preserve">) but per-recording aggregation recovers it to</w:t>
+      </w:r>
+      <w:r>
+        <w:t xml:space="preserve"> </w:t>
+      </w:r>
+      <m:oMath>
+        <m:r>
+          <m:t>0.93</m:t>
+        </m:r>
+      </m:oMath>
+      <w:r>
+        <w:t xml:space="preserve">–</w:t>
+      </w:r>
+      <m:oMath>
+        <m:r>
+          <m:t>0.95</m:t>
+        </m:r>
+      </m:oMath>
+      <w:r>
+        <w:t xml:space="preserve">. Future work</w:t>
+      </w:r>
+      <w:r>
+        <w:t xml:space="preserve"> </w:t>
+      </w:r>
+      <w:r>
+        <w:t xml:space="preserve">includes closing the residual per-window phase gap (higher sampling, supervised phase calibration), a</w:t>
+      </w:r>
+      <w:r>
+        <w:t xml:space="preserve"> </w:t>
+      </w:r>
+      <w:r>
+        <w:t xml:space="preserve">stronger conditional generator for physics-constrained augmentation,</w:t>
       </w:r>
       <w:r>
         <w:t xml:space="preserve"> </w:t>

</xml_diff>